<commit_message>
Update resume docx and regenerated PDF with compliance fixes
Applied name change to Saantu Roy, added bank names (Citibank, UBS, Credit Suisse, Standard Chartered, Kasikorn) as highlighted text in Professional Summary only, and removed all bank name references from employer lines and project entries. Regenerated Santu_Roy_Resume_27.pdf from updated docx.

Co-Authored-By: Claude Sonnet 4.6 <noreply@anthropic.com>
Claude-Session: https://claude.ai/code/session_01KEbZjLtsRX3g3Z8k5EaWM4
</commit_message>
<xml_diff>
--- a/Santu_Roy_Resume_2026.docx
+++ b/Santu_Roy_Resume_2026.docx
@@ -14,7 +14,7 @@
           <w:color w:val="1F3C73"/>
           <w:sz w:val="48"/>
         </w:rPr>
-        <w:t>SANTU ROY</w:t>
+        <w:t>SAANTU ROY</w:t>
       </w:r>
     </w:p>
     <w:p>
@@ -158,6 +158,94 @@
           <w:sz w:val="20"/>
         </w:rPr>
         <w:t xml:space="preserve"> via GenAI-powered DevOps, and 20–30% delivery optimisation across multi-cloud transformation programmes. Bridges engineering execution (Python, FastAPI, Spring Boot, Kubernetes) with enterprise architecture governance (TOGAF) and C-suite stakeholder leadership.</w:t>
+      </w:r>
+      <w:r>
+        <w:rPr>
+          <w:rFonts w:ascii="Arial" w:hAnsi="Arial"/>
+          <w:b w:val="0"/>
+          <w:sz w:val="20"/>
+        </w:rPr>
+        <w:t xml:space="preserve"> Delivered enterprise solutions across global financial institutions including </w:t>
+      </w:r>
+      <w:r>
+        <w:rPr>
+          <w:rFonts w:ascii="Arial" w:hAnsi="Arial"/>
+          <w:b/>
+          <w:sz w:val="20"/>
+        </w:rPr>
+        <w:t>Citibank</w:t>
+      </w:r>
+      <w:r>
+        <w:rPr>
+          <w:rFonts w:ascii="Arial" w:hAnsi="Arial"/>
+          <w:b w:val="0"/>
+          <w:sz w:val="20"/>
+        </w:rPr>
+        <w:t xml:space="preserve">, </w:t>
+      </w:r>
+      <w:r>
+        <w:rPr>
+          <w:rFonts w:ascii="Arial" w:hAnsi="Arial"/>
+          <w:b/>
+          <w:sz w:val="20"/>
+        </w:rPr>
+        <w:t>UBS</w:t>
+      </w:r>
+      <w:r>
+        <w:rPr>
+          <w:rFonts w:ascii="Arial" w:hAnsi="Arial"/>
+          <w:b w:val="0"/>
+          <w:sz w:val="20"/>
+        </w:rPr>
+        <w:t xml:space="preserve">, </w:t>
+      </w:r>
+      <w:r>
+        <w:rPr>
+          <w:rFonts w:ascii="Arial" w:hAnsi="Arial"/>
+          <w:b/>
+          <w:sz w:val="20"/>
+        </w:rPr>
+        <w:t>Credit Suisse</w:t>
+      </w:r>
+      <w:r>
+        <w:rPr>
+          <w:rFonts w:ascii="Arial" w:hAnsi="Arial"/>
+          <w:b w:val="0"/>
+          <w:sz w:val="20"/>
+        </w:rPr>
+        <w:t xml:space="preserve">, </w:t>
+      </w:r>
+      <w:r>
+        <w:rPr>
+          <w:rFonts w:ascii="Arial" w:hAnsi="Arial"/>
+          <w:b/>
+          <w:sz w:val="20"/>
+        </w:rPr>
+        <w:t>Standard Chartered Bank</w:t>
+      </w:r>
+      <w:r>
+        <w:rPr>
+          <w:rFonts w:ascii="Arial" w:hAnsi="Arial"/>
+          <w:b w:val="0"/>
+          <w:sz w:val="20"/>
+        </w:rPr>
+        <w:t xml:space="preserve">, and </w:t>
+      </w:r>
+      <w:r>
+        <w:rPr>
+          <w:rFonts w:ascii="Arial" w:hAnsi="Arial"/>
+          <w:b/>
+          <w:sz w:val="20"/>
+        </w:rPr>
+        <w:t>Kasikorn Bank</w:t>
+      </w:r>
+      <w:r>
+        <w:rPr>
+          <w:rFonts w:ascii="Arial" w:hAnsi="Arial"/>
+          <w:b w:val="0"/>
+          <w:sz w:val="20"/>
+        </w:rPr>
+        <w:t>.</w:t>
       </w:r>
     </w:p>
     <w:p>
@@ -443,7 +531,7 @@
           <w:color w:val="1A1A1A"/>
           <w:sz w:val="20"/>
         </w:rPr>
-        <w:t>Wipro Limited, Bangalore  ·  Global Clients: Citibank, UBS</w:t>
+        <w:t>Wipro Limited, Bangalore</w:t>
       </w:r>
     </w:p>
     <w:p>
@@ -1028,7 +1116,7 @@
           <w:color w:val="1A1A1A"/>
           <w:sz w:val="20"/>
         </w:rPr>
-        <w:t>Standard Chartered Bank, Singapore</w:t>
+        <w:t>Financial Institution, Singapore</w:t>
       </w:r>
     </w:p>
     <w:p>
@@ -1148,7 +1236,7 @@
           <w:color w:val="1A1A1A"/>
           <w:sz w:val="20"/>
         </w:rPr>
-        <w:t>Kasikorn Bank, Bangkok, Thailand</w:t>
+        <w:t>Financial Institution, Bangkok, Thailand</w:t>
       </w:r>
     </w:p>
     <w:p>
@@ -1223,7 +1311,7 @@
           <w:color w:val="1A1A1A"/>
           <w:sz w:val="20"/>
         </w:rPr>
-        <w:t>Credit Suisse Bank, Singapore</w:t>
+        <w:t>Financial Institution, Singapore</w:t>
       </w:r>
     </w:p>
     <w:p>
@@ -1326,7 +1414,7 @@
           <w:color w:val="555555"/>
           <w:sz w:val="19"/>
         </w:rPr>
-        <w:t xml:space="preserve">  ·  Wipro / Citibank</w:t>
+        <w:t xml:space="preserve">  ·  Wipro</w:t>
       </w:r>
     </w:p>
     <w:p>
@@ -1526,7 +1614,6 @@
           <w:color w:val="555555"/>
           <w:sz w:val="19"/>
         </w:rPr>
-        <w:t xml:space="preserve">  ·  Credit Suisse</w:t>
       </w:r>
     </w:p>
     <w:p>

</xml_diff>